<commit_message>
docs(#1216): expand finals Q&A handbook
</commit_message>
<xml_diff>
--- a/outputs/TrustForge_決賽4分鐘備詢.docx
+++ b/outputs/TrustForge_決賽4分鐘備詢.docx
@@ -12,7 +12,7 @@
           <w:color w:val="21B894"/>
           <w:sz w:val="20"/>
         </w:rPr>
-        <w:t>決賽口袋版｜每題先結論，再證據</w:t>
+        <w:t>完整備詢版｜主答 30 秒，追問可延伸</w:t>
       </w:r>
     </w:p>
     <w:p>
@@ -34,7 +34,7 @@
           <w:color w:val="12A8C7"/>
           <w:sz w:val="28"/>
         </w:rPr>
-        <w:t>統問統答｜短答、證據、界線</w:t>
+        <w:t>評審問答｜直接回答、實證、界線與追問</w:t>
       </w:r>
     </w:p>
     <w:p>
@@ -76,7 +76,7 @@
                 <w:color w:val="3157C8"/>
                 <w:sz w:val="22"/>
               </w:rPr>
-              <w:t>答題公式：先用 10 秒講結論，再用 15 秒指出畫面／檔案證據，最後用 5 秒說限制或下一步。不要把未驗證能力講成已上線。</w:t>
+              <w:t>答題公式：先用 10 秒講結論，再用 15 秒指出畫面／檔案證據，最後用 5 秒說限制。若評審追問，再展開本手冊的技術、商業與風險細節。</w:t>
             </w:r>
           </w:p>
         </w:tc>
@@ -385,6 +385,428 @@
         <w:t>謝謝評審。TrustForge 的核心不是預測漲跌，而是在生成內容前建立可稽核的信任層；以下我們會直接回答，並以 Live Demo、Evidence List 或 Execution Log 作證。</w:t>
       </w:r>
     </w:p>
+    <w:p>
+      <w:pPr>
+        <w:pStyle w:val="Heading1"/>
+      </w:pPr>
+      <w:r>
+        <w:t>評分項目速查</w:t>
+      </w:r>
+    </w:p>
+    <w:tbl>
+      <w:tblPr>
+        <w:tblStyle w:val="TableGrid"/>
+        <w:tblW w:type="auto" w:w="0"/>
+        <w:jc w:val="center"/>
+        <w:tblLayout w:type="fixed"/>
+        <w:tblLook w:firstColumn="1" w:firstRow="1" w:lastColumn="0" w:lastRow="0" w:noHBand="0" w:noVBand="1" w:val="04A0"/>
+      </w:tblPr>
+      <w:tblGrid>
+        <w:gridCol w:w="3293"/>
+        <w:gridCol w:w="3293"/>
+        <w:gridCol w:w="3293"/>
+      </w:tblGrid>
+      <w:tr>
+        <w:tc>
+          <w:tcPr>
+            <w:tcW w:type="dxa" w:w="1512"/>
+            <w:shd w:fill="3157C8"/>
+            <w:vAlign w:val="center"/>
+          </w:tcPr>
+          <w:p>
+            <w:pPr>
+              <w:spacing w:after="0"/>
+            </w:pPr>
+            <w:r/>
+            <w:r>
+              <w:rPr>
+                <w:rFonts w:ascii="Microsoft JhengHei" w:hAnsi="Microsoft JhengHei"/>
+                <w:b/>
+                <w:color w:val="FFFFFF"/>
+                <w:sz w:val="18"/>
+              </w:rPr>
+              <w:t>評分項</w:t>
+            </w:r>
+          </w:p>
+        </w:tc>
+        <w:tc>
+          <w:tcPr>
+            <w:tcW w:type="dxa" w:w="3960"/>
+            <w:shd w:fill="3157C8"/>
+            <w:vAlign w:val="center"/>
+          </w:tcPr>
+          <w:p>
+            <w:pPr>
+              <w:spacing w:after="0"/>
+            </w:pPr>
+            <w:r/>
+            <w:r>
+              <w:rPr>
+                <w:rFonts w:ascii="Microsoft JhengHei" w:hAnsi="Microsoft JhengHei"/>
+                <w:b/>
+                <w:color w:val="FFFFFF"/>
+                <w:sz w:val="18"/>
+              </w:rPr>
+              <w:t>評審可能追問</w:t>
+            </w:r>
+          </w:p>
+        </w:tc>
+        <w:tc>
+          <w:tcPr>
+            <w:tcW w:type="dxa" w:w="4320"/>
+            <w:shd w:fill="3157C8"/>
+            <w:vAlign w:val="center"/>
+          </w:tcPr>
+          <w:p>
+            <w:pPr>
+              <w:spacing w:after="0"/>
+            </w:pPr>
+            <w:r/>
+            <w:r>
+              <w:rPr>
+                <w:rFonts w:ascii="Microsoft JhengHei" w:hAnsi="Microsoft JhengHei"/>
+                <w:b/>
+                <w:color w:val="FFFFFF"/>
+                <w:sz w:val="18"/>
+              </w:rPr>
+              <w:t>回答錨點</w:t>
+            </w:r>
+          </w:p>
+        </w:tc>
+      </w:tr>
+      <w:tr>
+        <w:tc>
+          <w:tcPr>
+            <w:tcW w:type="dxa" w:w="1512"/>
+            <w:vAlign w:val="center"/>
+          </w:tcPr>
+          <w:p>
+            <w:pPr>
+              <w:spacing w:after="0"/>
+            </w:pPr>
+            <w:r/>
+            <w:r>
+              <w:rPr>
+                <w:rFonts w:ascii="Microsoft JhengHei" w:hAnsi="Microsoft JhengHei"/>
+                <w:b w:val="0"/>
+                <w:color w:val="172033"/>
+                <w:sz w:val="18"/>
+              </w:rPr>
+              <w:t>主題 30%</w:t>
+            </w:r>
+          </w:p>
+        </w:tc>
+        <w:tc>
+          <w:tcPr>
+            <w:tcW w:type="dxa" w:w="3960"/>
+            <w:vAlign w:val="center"/>
+          </w:tcPr>
+          <w:p>
+            <w:pPr>
+              <w:spacing w:after="0"/>
+            </w:pPr>
+            <w:r/>
+            <w:r>
+              <w:rPr>
+                <w:rFonts w:ascii="Microsoft JhengHei" w:hAnsi="Microsoft JhengHei"/>
+                <w:b w:val="0"/>
+                <w:color w:val="172033"/>
+                <w:sz w:val="18"/>
+              </w:rPr>
+              <w:t>為什麼不是普通 RAG？</w:t>
+            </w:r>
+          </w:p>
+        </w:tc>
+        <w:tc>
+          <w:tcPr>
+            <w:tcW w:type="dxa" w:w="4320"/>
+            <w:vAlign w:val="center"/>
+          </w:tcPr>
+          <w:p>
+            <w:pPr>
+              <w:spacing w:after="0"/>
+            </w:pPr>
+            <w:r/>
+            <w:r>
+              <w:rPr>
+                <w:rFonts w:ascii="Microsoft JhengHei" w:hAnsi="Microsoft JhengHei"/>
+                <w:b w:val="0"/>
+                <w:color w:val="172033"/>
+                <w:sz w:val="18"/>
+              </w:rPr>
+              <w:t>獨立性、矛盾、雙軸信心、可回溯</w:t>
+            </w:r>
+          </w:p>
+        </w:tc>
+      </w:tr>
+      <w:tr>
+        <w:tc>
+          <w:tcPr>
+            <w:tcW w:type="dxa" w:w="1512"/>
+            <w:shd w:fill="F6F8FC"/>
+            <w:vAlign w:val="center"/>
+          </w:tcPr>
+          <w:p>
+            <w:pPr>
+              <w:spacing w:after="0"/>
+            </w:pPr>
+            <w:r/>
+            <w:r>
+              <w:rPr>
+                <w:rFonts w:ascii="Microsoft JhengHei" w:hAnsi="Microsoft JhengHei"/>
+                <w:b w:val="0"/>
+                <w:color w:val="172033"/>
+                <w:sz w:val="18"/>
+              </w:rPr>
+              <w:t>商業 25%</w:t>
+            </w:r>
+          </w:p>
+        </w:tc>
+        <w:tc>
+          <w:tcPr>
+            <w:tcW w:type="dxa" w:w="3960"/>
+            <w:shd w:fill="F6F8FC"/>
+            <w:vAlign w:val="center"/>
+          </w:tcPr>
+          <w:p>
+            <w:pPr>
+              <w:spacing w:after="0"/>
+            </w:pPr>
+            <w:r/>
+            <w:r>
+              <w:rPr>
+                <w:rFonts w:ascii="Microsoft JhengHei" w:hAnsi="Microsoft JhengHei"/>
+                <w:b w:val="0"/>
+                <w:color w:val="172033"/>
+                <w:sz w:val="18"/>
+              </w:rPr>
+              <w:t>HOYA BIT 為什麼需要？</w:t>
+            </w:r>
+          </w:p>
+        </w:tc>
+        <w:tc>
+          <w:tcPr>
+            <w:tcW w:type="dxa" w:w="4320"/>
+            <w:shd w:fill="F6F8FC"/>
+            <w:vAlign w:val="center"/>
+          </w:tcPr>
+          <w:p>
+            <w:pPr>
+              <w:spacing w:after="0"/>
+            </w:pPr>
+            <w:r/>
+            <w:r>
+              <w:rPr>
+                <w:rFonts w:ascii="Microsoft JhengHei" w:hAnsi="Microsoft JhengHei"/>
+                <w:b w:val="0"/>
+                <w:color w:val="172033"/>
+                <w:sz w:val="18"/>
+              </w:rPr>
+              <w:t>降低查核時間、內容責任邊界、白標 API</w:t>
+            </w:r>
+          </w:p>
+        </w:tc>
+      </w:tr>
+      <w:tr>
+        <w:tc>
+          <w:tcPr>
+            <w:tcW w:type="dxa" w:w="1512"/>
+            <w:vAlign w:val="center"/>
+          </w:tcPr>
+          <w:p>
+            <w:pPr>
+              <w:spacing w:after="0"/>
+            </w:pPr>
+            <w:r/>
+            <w:r>
+              <w:rPr>
+                <w:rFonts w:ascii="Microsoft JhengHei" w:hAnsi="Microsoft JhengHei"/>
+                <w:b w:val="0"/>
+                <w:color w:val="172033"/>
+                <w:sz w:val="18"/>
+              </w:rPr>
+              <w:t>技術 20%</w:t>
+            </w:r>
+          </w:p>
+        </w:tc>
+        <w:tc>
+          <w:tcPr>
+            <w:tcW w:type="dxa" w:w="3960"/>
+            <w:vAlign w:val="center"/>
+          </w:tcPr>
+          <w:p>
+            <w:pPr>
+              <w:spacing w:after="0"/>
+            </w:pPr>
+            <w:r/>
+            <w:r>
+              <w:rPr>
+                <w:rFonts w:ascii="Microsoft JhengHei" w:hAnsi="Microsoft JhengHei"/>
+                <w:b w:val="0"/>
+                <w:color w:val="172033"/>
+                <w:sz w:val="18"/>
+              </w:rPr>
+              <w:t>真的能跑、能降級嗎？</w:t>
+            </w:r>
+          </w:p>
+        </w:tc>
+        <w:tc>
+          <w:tcPr>
+            <w:tcW w:type="dxa" w:w="4320"/>
+            <w:vAlign w:val="center"/>
+          </w:tcPr>
+          <w:p>
+            <w:pPr>
+              <w:spacing w:after="0"/>
+            </w:pPr>
+            <w:r/>
+            <w:r>
+              <w:rPr>
+                <w:rFonts w:ascii="Microsoft JhengHei" w:hAnsi="Microsoft JhengHei"/>
+                <w:b w:val="0"/>
+                <w:color w:val="172033"/>
+                <w:sz w:val="18"/>
+              </w:rPr>
+              <w:t>Trust Kernel 與 Bedrock 分工、Log、時間預算</w:t>
+            </w:r>
+          </w:p>
+        </w:tc>
+      </w:tr>
+      <w:tr>
+        <w:tc>
+          <w:tcPr>
+            <w:tcW w:type="dxa" w:w="1512"/>
+            <w:shd w:fill="F6F8FC"/>
+            <w:vAlign w:val="center"/>
+          </w:tcPr>
+          <w:p>
+            <w:pPr>
+              <w:spacing w:after="0"/>
+            </w:pPr>
+            <w:r/>
+            <w:r>
+              <w:rPr>
+                <w:rFonts w:ascii="Microsoft JhengHei" w:hAnsi="Microsoft JhengHei"/>
+                <w:b w:val="0"/>
+                <w:color w:val="172033"/>
+                <w:sz w:val="18"/>
+              </w:rPr>
+              <w:t>創意 15%</w:t>
+            </w:r>
+          </w:p>
+        </w:tc>
+        <w:tc>
+          <w:tcPr>
+            <w:tcW w:type="dxa" w:w="3960"/>
+            <w:shd w:fill="F6F8FC"/>
+            <w:vAlign w:val="center"/>
+          </w:tcPr>
+          <w:p>
+            <w:pPr>
+              <w:spacing w:after="0"/>
+            </w:pPr>
+            <w:r/>
+            <w:r>
+              <w:rPr>
+                <w:rFonts w:ascii="Microsoft JhengHei" w:hAnsi="Microsoft JhengHei"/>
+                <w:b w:val="0"/>
+                <w:color w:val="172033"/>
+                <w:sz w:val="18"/>
+              </w:rPr>
+              <w:t>哪個功能是你們獨有？</w:t>
+            </w:r>
+          </w:p>
+        </w:tc>
+        <w:tc>
+          <w:tcPr>
+            <w:tcW w:type="dxa" w:w="4320"/>
+            <w:shd w:fill="F6F8FC"/>
+            <w:vAlign w:val="center"/>
+          </w:tcPr>
+          <w:p>
+            <w:pPr>
+              <w:spacing w:after="0"/>
+            </w:pPr>
+            <w:r/>
+            <w:r>
+              <w:rPr>
+                <w:rFonts w:ascii="Microsoft JhengHei" w:hAnsi="Microsoft JhengHei"/>
+                <w:b w:val="0"/>
+                <w:color w:val="172033"/>
+                <w:sz w:val="18"/>
+              </w:rPr>
+              <w:t>四個信任工具與反事實 A/B</w:t>
+            </w:r>
+          </w:p>
+        </w:tc>
+      </w:tr>
+      <w:tr>
+        <w:tc>
+          <w:tcPr>
+            <w:tcW w:type="dxa" w:w="1512"/>
+            <w:vAlign w:val="center"/>
+          </w:tcPr>
+          <w:p>
+            <w:pPr>
+              <w:spacing w:after="0"/>
+            </w:pPr>
+            <w:r/>
+            <w:r>
+              <w:rPr>
+                <w:rFonts w:ascii="Microsoft JhengHei" w:hAnsi="Microsoft JhengHei"/>
+                <w:b w:val="0"/>
+                <w:color w:val="172033"/>
+                <w:sz w:val="18"/>
+              </w:rPr>
+              <w:t>完成 10%</w:t>
+            </w:r>
+          </w:p>
+        </w:tc>
+        <w:tc>
+          <w:tcPr>
+            <w:tcW w:type="dxa" w:w="3960"/>
+            <w:vAlign w:val="center"/>
+          </w:tcPr>
+          <w:p>
+            <w:pPr>
+              <w:spacing w:after="0"/>
+            </w:pPr>
+            <w:r/>
+            <w:r>
+              <w:rPr>
+                <w:rFonts w:ascii="Microsoft JhengHei" w:hAnsi="Microsoft JhengHei"/>
+                <w:b w:val="0"/>
+                <w:color w:val="172033"/>
+                <w:sz w:val="18"/>
+              </w:rPr>
+              <w:t>當場失敗怎麼辦？</w:t>
+            </w:r>
+          </w:p>
+        </w:tc>
+        <w:tc>
+          <w:tcPr>
+            <w:tcW w:type="dxa" w:w="4320"/>
+            <w:vAlign w:val="center"/>
+          </w:tcPr>
+          <w:p>
+            <w:pPr>
+              <w:spacing w:after="0"/>
+            </w:pPr>
+            <w:r/>
+            <w:r>
+              <w:rPr>
+                <w:rFonts w:ascii="Microsoft JhengHei" w:hAnsi="Microsoft JhengHei"/>
+                <w:b w:val="0"/>
+                <w:color w:val="172033"/>
+                <w:sz w:val="18"/>
+              </w:rPr>
+              <w:t>四份交付、獨立降級、可診斷失敗</w:t>
+            </w:r>
+          </w:p>
+        </w:tc>
+      </w:tr>
+    </w:tbl>
+    <w:p/>
     <w:p>
       <w:pPr>
         <w:sectPr>
@@ -807,6 +1229,294 @@
       </w:r>
       <w:r>
         <w:t>limitations／could_flip</w:t>
+      </w:r>
+    </w:p>
+    <w:p>
+      <w:pPr>
+        <w:pStyle w:val="Heading2"/>
+      </w:pPr>
+      <w:r>
+        <w:t>13. 來源獨立性怎麼判斷？</w:t>
+      </w:r>
+    </w:p>
+    <w:p>
+      <w:r>
+        <w:rPr>
+          <w:b/>
+          <w:color w:val="3157C8"/>
+        </w:rPr>
+        <w:t>回答｜</w:t>
+      </w:r>
+      <w:r>
+        <w:t>系統先正規化來源、比對近似文本與引用關係，再將 N 篇文章收旂為 K 個獨立集群。獨立佐證先去重再計票，避免把新聞聯播當成多方共識。資料稀疏時會顯示覆蓋不足，不強行補滿。</w:t>
+      </w:r>
+    </w:p>
+    <w:p>
+      <w:r>
+        <w:rPr>
+          <w:b/>
+          <w:color w:val="21B894"/>
+        </w:rPr>
+        <w:t>指證｜</w:t>
+      </w:r>
+      <w:r>
+        <w:t>Evidence 來源分組／獨立佐證數</w:t>
+      </w:r>
+    </w:p>
+    <w:p>
+      <w:pPr>
+        <w:pStyle w:val="Heading2"/>
+      </w:pPr>
+      <w:r>
+        <w:t>14. 矛盾帳本和正反方摘要有何不同？</w:t>
+      </w:r>
+    </w:p>
+    <w:p>
+      <w:r>
+        <w:rPr>
+          <w:b/>
+          <w:color w:val="3157C8"/>
+        </w:rPr>
+        <w:t>回答｜</w:t>
+      </w:r>
+      <w:r>
+        <w:t>矛盾帳本不只保留正反文字，還保留每條訊號的來源、原文、claim_id 與信任分項。使用者可看見鏈上、價格、新聞或社群為何互相衝突，以及系統為何比較相信某一邊。</w:t>
+      </w:r>
+    </w:p>
+    <w:p>
+      <w:r>
+        <w:rPr>
+          <w:b/>
+          <w:color w:val="21B894"/>
+        </w:rPr>
+        <w:t>指證｜</w:t>
+      </w:r>
+      <w:r>
+        <w:t>Cross-source Signal／Trust Breakdown</w:t>
+      </w:r>
+    </w:p>
+    <w:p>
+      <w:pPr>
+        <w:pStyle w:val="Heading2"/>
+      </w:pPr>
+      <w:r>
+        <w:t>15. 雙軸信心為什麼比單一分數好？</w:t>
+      </w:r>
+    </w:p>
+    <w:p>
+      <w:r>
+        <w:rPr>
+          <w:b/>
+          <w:color w:val="3157C8"/>
+        </w:rPr>
+        <w:t>回答｜</w:t>
+      </w:r>
+      <w:r>
+        <w:t>方向判斷很明確，不代表資料就完整。TrustForge 把『對目前方向的判斷』與『證據覆蓋程度』分開，所以可以誠實表達『現有訊號偏多，但鏈上覆蓋不足』，不用一個黑箱數字掉包。</w:t>
+      </w:r>
+    </w:p>
+    <w:p>
+      <w:r>
+        <w:rPr>
+          <w:b/>
+          <w:color w:val="21B894"/>
+        </w:rPr>
+        <w:t>指證｜</w:t>
+      </w:r>
+      <w:r>
+        <w:t>Confidence Gauge／information completeness</w:t>
+      </w:r>
+    </w:p>
+    <w:p>
+      <w:pPr>
+        <w:pStyle w:val="Heading2"/>
+      </w:pPr>
+      <w:r>
+        <w:t>16. 什麼是負空間情報？</w:t>
+      </w:r>
+    </w:p>
+    <w:p>
+      <w:r>
+        <w:rPr>
+          <w:b/>
+          <w:color w:val="3157C8"/>
+        </w:rPr>
+        <w:t>回答｜</w:t>
+      </w:r>
+      <w:r>
+        <w:t>我們不只報告找到的事件，也報告在已揭露的資料範圍與時間窗內沒有觀察到什麼。但措辭必須是『未觀察到』，不是『不存在』；同時列出資料源覆蓋限制，避免把沉默過度解讀成利多或利空。</w:t>
+      </w:r>
+    </w:p>
+    <w:p>
+      <w:r>
+        <w:rPr>
+          <w:b/>
+          <w:color w:val="21B894"/>
+        </w:rPr>
+        <w:t>指證｜</w:t>
+      </w:r>
+      <w:r>
+        <w:t>Negative-space insight／coverage note</w:t>
+      </w:r>
+    </w:p>
+    <w:p>
+      <w:pPr>
+        <w:pStyle w:val="Heading2"/>
+      </w:pPr>
+      <w:r>
+        <w:t>17. 反事實 A/B 會不會是為了 Demo 設計的假案例？</w:t>
+      </w:r>
+    </w:p>
+    <w:p>
+      <w:r>
+        <w:rPr>
+          <w:b/>
+          <w:color w:val="3157C8"/>
+        </w:rPr>
+        <w:t>回答｜</w:t>
+      </w:r>
+      <w:r>
+        <w:t>A/B 用同一批輸入，只改變信任層是否啟用，比較去重、信心與限制如何變化。我們會明說它是賽前離線方法對照，不把合成情境說成真實攻擊，也不佔用正式 15 分鐘執行。</w:t>
+      </w:r>
+    </w:p>
+    <w:p>
+      <w:r>
+        <w:rPr>
+          <w:b/>
+          <w:color w:val="21B894"/>
+        </w:rPr>
+        <w:t>指證｜</w:t>
+      </w:r>
+      <w:r>
+        <w:t>A/B 對照截圖／方法說明</w:t>
+      </w:r>
+    </w:p>
+    <w:p>
+      <w:pPr>
+        <w:pStyle w:val="Heading2"/>
+      </w:pPr>
+      <w:r>
+        <w:t>18. HOYA BIT 要如何整合？</w:t>
+      </w:r>
+    </w:p>
+    <w:p>
+      <w:r>
+        <w:rPr>
+          <w:b/>
+          <w:color w:val="3157C8"/>
+        </w:rPr>
+        <w:t>回答｜</w:t>
+      </w:r>
+      <w:r>
+        <w:t>短期可先在市場資訊頁加入資訊完整度、Evidence 抽查與反轉條件；中期以 Trust Layer API 回傳結構化 Claim、Evidence 與 Log，不需替換 HOYA BIT 原有交易或內容系統。建議用四週 PoC 先驗證整合成本與使用者查核時間。</w:t>
+      </w:r>
+    </w:p>
+    <w:p>
+      <w:r>
+        <w:rPr>
+          <w:b/>
+          <w:color w:val="21B894"/>
+        </w:rPr>
+        <w:t>指證｜</w:t>
+      </w:r>
+      <w:r>
+        <w:t>整合路線／API 契約／PoC KPI</w:t>
+      </w:r>
+    </w:p>
+    <w:p>
+      <w:pPr>
+        <w:pStyle w:val="Heading2"/>
+      </w:pPr>
+      <w:r>
+        <w:t>19. 如何計算成本與控制 Bedrock 預算？</w:t>
+      </w:r>
+    </w:p>
+    <w:p>
+      <w:r>
+        <w:rPr>
+          <w:b/>
+          <w:color w:val="3157C8"/>
+        </w:rPr>
+        <w:t>回答｜</w:t>
+      </w:r>
+      <w:r>
+        <w:t>每次執行在 Execution Log 記錄模型、token、成本與耗時；執行前保留預算，接近時間或金額上限時跳過非必要複審。成本不應只用平均值承諾，會以實際題型、資料量與模型用量做 PoC 基準。</w:t>
+      </w:r>
+    </w:p>
+    <w:p>
+      <w:r>
+        <w:rPr>
+          <w:b/>
+          <w:color w:val="21B894"/>
+        </w:rPr>
+        <w:t>指證｜</w:t>
+      </w:r>
+      <w:r>
+        <w:t>Execution Log／budget guard</w:t>
+      </w:r>
+    </w:p>
+    <w:p>
+      <w:pPr>
+        <w:pStyle w:val="Heading2"/>
+      </w:pPr>
+      <w:r>
+        <w:t>20. 資安與機密資料如何保護？</w:t>
+      </w:r>
+    </w:p>
+    <w:p>
+      <w:r>
+        <w:rPr>
+          <w:b/>
+          <w:color w:val="3157C8"/>
+        </w:rPr>
+        <w:t>回答｜</w:t>
+      </w:r>
+      <w:r>
+        <w:t>長效憑證不進 Git，由 IAM Instance Role 與 SSM 管理；Python API 只聽 loopback，對外由 HTTPS 與 nginx 承接。公開的 Evidence 與 Log 應採 allowlist，只顯示評審查核需要的來源、時間、模型與成本，不透出 secret 或內部錯誤堆疊。</w:t>
+      </w:r>
+    </w:p>
+    <w:p>
+      <w:r>
+        <w:rPr>
+          <w:b/>
+          <w:color w:val="21B894"/>
+        </w:rPr>
+        <w:t>指證｜</w:t>
+      </w:r>
+      <w:r>
+        <w:t>IAM／SSM／HTTPS／public allowlist</w:t>
+      </w:r>
+    </w:p>
+    <w:p>
+      <w:pPr>
+        <w:pStyle w:val="Heading2"/>
+      </w:pPr>
+      <w:r>
+        <w:t>21. Kiro 加分不只是有安裝 IDE 嗎？</w:t>
+      </w:r>
+    </w:p>
+    <w:p>
+      <w:r>
+        <w:rPr>
+          <w:b/>
+          <w:color w:val="3157C8"/>
+        </w:rPr>
+        <w:t>回答｜</w:t>
+      </w:r>
+      <w:r>
+        <w:t>我們保留 Kiro spec 作為需求、驗收條件、設計與實作的追溯鏈，並以 hooks 與 steering 固定開發約束。評審可直接從 .kiro 記錄對照功能與驗收，而不是只看一張 IDE 截圖。</w:t>
+      </w:r>
+    </w:p>
+    <w:p>
+      <w:r>
+        <w:rPr>
+          <w:b/>
+          <w:color w:val="21B894"/>
+        </w:rPr>
+        <w:t>指證｜</w:t>
+      </w:r>
+      <w:r>
+        <w:t>.kiro/specs／hooks／steering</w:t>
       </w:r>
     </w:p>
     <w:p>

</xml_diff>

<commit_message>
docs: align proposal and Q&A with model training narrative
</commit_message>
<xml_diff>
--- a/outputs/TrustForge_決賽4分鐘備詢.docx
+++ b/outputs/TrustForge_決賽4分鐘備詢.docx
@@ -667,7 +667,7 @@
                 <w:color w:val="172033"/>
                 <w:sz w:val="18"/>
               </w:rPr>
-              <w:t>Trust Kernel 與 Bedrock 分工、Log、時間預算</w:t>
+              <w:t>Trust Kernel、Bedrock、訓練後端、Log</w:t>
             </w:r>
           </w:p>
         </w:tc>
@@ -735,7 +735,7 @@
                 <w:color w:val="172033"/>
                 <w:sz w:val="18"/>
               </w:rPr>
-              <w:t>四個信任工具與反事實 A/B</w:t>
+              <w:t>信任工具、自有校準模型、受控學習</w:t>
             </w:r>
           </w:p>
         </w:tc>
@@ -1172,7 +1172,7 @@
         <w:pStyle w:val="Heading2"/>
       </w:pPr>
       <w:r>
-        <w:t>11. 系統會自我學習嗎？</w:t>
+        <w:t>11. 資料來源有哪些？</w:t>
       </w:r>
     </w:p>
     <w:p>
@@ -1184,7 +1184,7 @@
         <w:t>回答｜</w:t>
       </w:r>
       <w:r>
-        <w:t>歷史 JSONL 有 2,005 筆；Three-track 與 AGOS 尚未啟用的部分不列為正式成果。所有升級需經測試、審查與版本控制，不允許自行上線。</w:t>
+        <w:t>我們整合六類資料：HOYA BIT／OHLCV 市場行情、鏈上活動、公開新聞、官方與監管公告、公開社群情緒，以及 CoinGecko、DefiLlama、CMC 等基本面與生態指標。每筆都保存來源、取得時間、查詢條件與引用片段。</w:t>
       </w:r>
     </w:p>
     <w:p>
@@ -1196,7 +1196,7 @@
         <w:t>指證｜</w:t>
       </w:r>
       <w:r>
-        <w:t>版本／審查紀錄</w:t>
+        <w:t>Evidence List／source family</w:t>
       </w:r>
     </w:p>
     <w:p>
@@ -1204,7 +1204,135 @@
         <w:pStyle w:val="Heading2"/>
       </w:pPr>
       <w:r>
-        <w:t>12. 目前最大的限制？</w:t>
+        <w:t>12. 你們有自行訓練模型嗎？</w:t>
+      </w:r>
+    </w:p>
+    <w:p>
+      <w:r>
+        <w:rPr>
+          <w:b/>
+          <w:color w:val="3157C8"/>
+        </w:rPr>
+        <w:t>回答｜</w:t>
+      </w:r>
+      <w:r>
+        <w:t>有。我們自行訓練的是 TrustForge 信心校準模型，不是大型語言模型。它把分析當下的資料接回 T+7 等後續真實結果，再用 Isotonic Regression 校正 raw confidence；Bedrock 仍負責生成式 AI 的抽取與敘事。</w:t>
+      </w:r>
+    </w:p>
+    <w:p>
+      <w:r>
+        <w:rPr>
+          <w:b/>
+          <w:color w:val="21B894"/>
+        </w:rPr>
+        <w:t>指證｜</w:t>
+      </w:r>
+      <w:r>
+        <w:t>Training data／calibration artifact</w:t>
+      </w:r>
+    </w:p>
+    <w:p>
+      <w:pPr>
+        <w:pStyle w:val="Heading2"/>
+      </w:pPr>
+      <w:r>
+        <w:t>13. 為什麼不只使用 AWS 現成模型？</w:t>
+      </w:r>
+    </w:p>
+    <w:p>
+      <w:r>
+        <w:rPr>
+          <w:b/>
+          <w:color w:val="3157C8"/>
+        </w:rPr>
+        <w:t>回答｜</w:t>
+      </w:r>
+      <w:r>
+        <w:t>AWS 基礎模型擅長語意與生成，但不知道 TrustForge 的 Evidence、來源可靠度與信心定義。自有校準模型能針對任務修正過度自信、跟上市場變化，並累積來源可靠度資料護城河。</w:t>
+      </w:r>
+    </w:p>
+    <w:p>
+      <w:r>
+        <w:rPr>
+          <w:b/>
+          <w:color w:val="21B894"/>
+        </w:rPr>
+        <w:t>指證｜</w:t>
+      </w:r>
+      <w:r>
+        <w:t>calibrated confidence／來源可靠度</w:t>
+      </w:r>
+    </w:p>
+    <w:p>
+      <w:pPr>
+        <w:pStyle w:val="Heading2"/>
+      </w:pPr>
+      <w:r>
+        <w:t>14. ModelHub 和 SageMaker 是什麼關係？</w:t>
+      </w:r>
+    </w:p>
+    <w:p>
+      <w:r>
+        <w:rPr>
+          <w:b/>
+          <w:color w:val="3157C8"/>
+        </w:rPr>
+        <w:t>回答｜</w:t>
+      </w:r>
+      <w:r>
+        <w:t>兩者是可替換的訓練後端，不是前後串接的固定流程。ModelHub 以 req_no 執行並回傳訓練結果；Amazon SageMaker 以 Training Job 與 S3 交付產物。TrustForge 自己掌握資料 Gate、評估、版本與啟用決策。</w:t>
+      </w:r>
+    </w:p>
+    <w:p>
+      <w:r>
+        <w:rPr>
+          <w:b/>
+          <w:color w:val="21B894"/>
+        </w:rPr>
+        <w:t>指證｜</w:t>
+      </w:r>
+      <w:r>
+        <w:t>TrainingBackend／job／artifact SHA-256</w:t>
+      </w:r>
+    </w:p>
+    <w:p>
+      <w:pPr>
+        <w:pStyle w:val="Heading2"/>
+      </w:pPr>
+      <w:r>
+        <w:t>15. 模型會自動更新嗎？</w:t>
+      </w:r>
+    </w:p>
+    <w:p>
+      <w:r>
+        <w:rPr>
+          <w:b/>
+          <w:color w:val="3157C8"/>
+        </w:rPr>
+        <w:t>回答｜</w:t>
+      </w:r>
+      <w:r>
+        <w:t>不會。新模型只會成為 candidate，automatic_apply 固定為 false；必須通過資料 Gate、holdout 比較、產物驗證與人工核准，才有資格啟用。</w:t>
+      </w:r>
+    </w:p>
+    <w:p>
+      <w:r>
+        <w:rPr>
+          <w:b/>
+          <w:color w:val="21B894"/>
+        </w:rPr>
+        <w:t>指證｜</w:t>
+      </w:r>
+      <w:r>
+        <w:t>candidate proposal／approval record</w:t>
+      </w:r>
+    </w:p>
+    <w:p>
+      <w:pPr>
+        <w:pStyle w:val="Heading2"/>
+      </w:pPr>
+      <w:r>
+        <w:t>16. 目前最大的限制？</w:t>
       </w:r>
     </w:p>
     <w:p>
@@ -1236,7 +1364,7 @@
         <w:pStyle w:val="Heading2"/>
       </w:pPr>
       <w:r>
-        <w:t>13. 來源獨立性怎麼判斷？</w:t>
+        <w:t>17. 來源獨立性怎麼判斷？</w:t>
       </w:r>
     </w:p>
     <w:p>
@@ -1268,7 +1396,7 @@
         <w:pStyle w:val="Heading2"/>
       </w:pPr>
       <w:r>
-        <w:t>14. 矛盾帳本和正反方摘要有何不同？</w:t>
+        <w:t>18. 矛盾帳本和正反方摘要有何不同？</w:t>
       </w:r>
     </w:p>
     <w:p>
@@ -1300,7 +1428,7 @@
         <w:pStyle w:val="Heading2"/>
       </w:pPr>
       <w:r>
-        <w:t>15. 雙軸信心為什麼比單一分數好？</w:t>
+        <w:t>19. 雙軸信心為什麼比單一分數好？</w:t>
       </w:r>
     </w:p>
     <w:p>
@@ -1332,7 +1460,7 @@
         <w:pStyle w:val="Heading2"/>
       </w:pPr>
       <w:r>
-        <w:t>16. 什麼是負空間情報？</w:t>
+        <w:t>20. 什麼是負空間情報？</w:t>
       </w:r>
     </w:p>
     <w:p>
@@ -1364,7 +1492,7 @@
         <w:pStyle w:val="Heading2"/>
       </w:pPr>
       <w:r>
-        <w:t>17. 反事實 A/B 會不會是為了 Demo 設計的假案例？</w:t>
+        <w:t>21. 反事實 A/B 會不會是為了 Demo 設計的假案例？</w:t>
       </w:r>
     </w:p>
     <w:p>
@@ -1396,7 +1524,7 @@
         <w:pStyle w:val="Heading2"/>
       </w:pPr>
       <w:r>
-        <w:t>18. HOYA BIT 要如何整合？</w:t>
+        <w:t>22. HOYA BIT 要如何整合？</w:t>
       </w:r>
     </w:p>
     <w:p>
@@ -1428,7 +1556,7 @@
         <w:pStyle w:val="Heading2"/>
       </w:pPr>
       <w:r>
-        <w:t>19. 如何計算成本與控制 Bedrock 預算？</w:t>
+        <w:t>23. 如何計算成本與控制 Bedrock 預算？</w:t>
       </w:r>
     </w:p>
     <w:p>
@@ -1460,7 +1588,7 @@
         <w:pStyle w:val="Heading2"/>
       </w:pPr>
       <w:r>
-        <w:t>20. 資安與機密資料如何保護？</w:t>
+        <w:t>24. 資安與機密資料如何保護？</w:t>
       </w:r>
     </w:p>
     <w:p>
@@ -1492,7 +1620,7 @@
         <w:pStyle w:val="Heading2"/>
       </w:pPr>
       <w:r>
-        <w:t>21. Kiro 加分不只是有安裝 IDE 嗎？</w:t>
+        <w:t>25. Kiro 加分不只是有安裝 IDE 嗎？</w:t>
       </w:r>
     </w:p>
     <w:p>

</xml_diff>